<commit_message>
Handoff: add the working rules that each error this session violated, and where everything lives.
</commit_message>
<xml_diff>
--- a/00_admin/assessments/HANDOFF.docx
+++ b/00_admin/assessments/HANDOFF.docx
@@ -2,7 +2,7 @@
 <file path=word/document.xml><?xml version="1.0" encoding="utf-8"?>
 <w:document xmlns:w="http://schemas.openxmlformats.org/wordprocessingml/2006/main" xmlns:m="http://schemas.openxmlformats.org/officeDocument/2006/math" xmlns:r="http://schemas.openxmlformats.org/officeDocument/2006/relationships" xmlns:o="urn:schemas-microsoft-com:office:office" xmlns:v="urn:schemas-microsoft-com:vml" xmlns:w10="urn:schemas-microsoft-com:office:word" xmlns:a="http://schemas.openxmlformats.org/drawingml/2006/main" xmlns:pic="http://schemas.openxmlformats.org/drawingml/2006/picture" xmlns:wp="http://schemas.openxmlformats.org/drawingml/2006/wordprocessingDrawing">
   <w:body>
-    <w:bookmarkStart w:id="43" w:name="Xab0e9911d1e18aa836dc08fb9c24256eea267cb"/>
+    <w:bookmarkStart w:id="49" w:name="Xab0e9911d1e18aa836dc08fb9c24256eea267cb"/>
     <w:p>
       <w:pPr>
         <w:pStyle w:val="Heading1"/>
@@ -38,7 +38,533 @@
         </w:pict>
       </w:r>
     </w:p>
-    <w:bookmarkStart w:id="20" w:name="where-the-pipeline-is-now"/>
+    <w:bookmarkStart w:id="24" w:name="how-to-work-on-this-project"/>
+    <w:p>
+      <w:pPr>
+        <w:pStyle w:val="Heading2"/>
+      </w:pPr>
+      <w:r>
+        <w:t xml:space="preserve">0. How to work on this project</w:t>
+      </w:r>
+    </w:p>
+    <w:p>
+      <w:pPr>
+        <w:pStyle w:val="FirstParagraph"/>
+      </w:pPr>
+      <w:r>
+        <w:rPr>
+          <w:bCs/>
+          <w:b/>
+        </w:rPr>
+        <w:t xml:space="preserve">Read this section before anything else.</w:t>
+      </w:r>
+      <w:r>
+        <w:t xml:space="preserve"> </w:t>
+      </w:r>
+      <w:r>
+        <w:t xml:space="preserve">Every expensive error in this project</w:t>
+      </w:r>
+      <w:r>
+        <w:t xml:space="preserve"> </w:t>
+      </w:r>
+      <w:r>
+        <w:t xml:space="preserve">came from breaking one of these rules.</w:t>
+      </w:r>
+    </w:p>
+    <w:bookmarkStart w:id="20" w:name="Xf157febec6658a466182e3e078a2052ed7c5a56"/>
+    <w:p>
+      <w:pPr>
+        <w:pStyle w:val="Heading3"/>
+      </w:pPr>
+      <w:r>
+        <w:t xml:space="preserve">Say only what the output shows or the literature states</w:t>
+      </w:r>
+    </w:p>
+    <w:p>
+      <w:pPr>
+        <w:pStyle w:val="FirstParagraph"/>
+      </w:pPr>
+      <w:r>
+        <w:t xml:space="preserve">Two sources are admissible: a command whose output is in front of you, and a</w:t>
+      </w:r>
+      <w:r>
+        <w:t xml:space="preserve"> </w:t>
+      </w:r>
+      <w:r>
+        <w:t xml:space="preserve">paper that has been read. Nothing else.</w:t>
+      </w:r>
+    </w:p>
+    <w:p>
+      <w:pPr>
+        <w:numPr>
+          <w:ilvl w:val="0"/>
+          <w:numId w:val="1001"/>
+        </w:numPr>
+        <w:pStyle w:val="Compact"/>
+      </w:pPr>
+      <w:r>
+        <w:t xml:space="preserve">If a number is quoted, it came from a file that was opened. Do not reconstruct</w:t>
+      </w:r>
+      <w:r>
+        <w:t xml:space="preserve"> </w:t>
+      </w:r>
+      <w:r>
+        <w:t xml:space="preserve">figures from memory, and do not carry a value forward from earlier in a</w:t>
+      </w:r>
+      <w:r>
+        <w:t xml:space="preserve"> </w:t>
+      </w:r>
+      <w:r>
+        <w:t xml:space="preserve">conversation without re-reading it if anything has changed.</w:t>
+      </w:r>
+    </w:p>
+    <w:p>
+      <w:pPr>
+        <w:numPr>
+          <w:ilvl w:val="0"/>
+          <w:numId w:val="1001"/>
+        </w:numPr>
+        <w:pStyle w:val="Compact"/>
+      </w:pPr>
+      <w:r>
+        <w:t xml:space="preserve">If a claim needs a citation and the paper is not in the repository,</w:t>
+      </w:r>
+      <w:r>
+        <w:t xml:space="preserve"> </w:t>
+      </w:r>
+      <w:r>
+        <w:rPr>
+          <w:bCs/>
+          <w:b/>
+        </w:rPr>
+        <w:t xml:space="preserve">say so and</w:t>
+      </w:r>
+      <w:r>
+        <w:rPr>
+          <w:bCs/>
+          <w:b/>
+        </w:rPr>
+        <w:t xml:space="preserve"> </w:t>
+      </w:r>
+      <w:r>
+        <w:rPr>
+          <w:bCs/>
+          <w:b/>
+        </w:rPr>
+        <w:t xml:space="preserve">ask for the DOI.</w:t>
+      </w:r>
+      <w:r>
+        <w:t xml:space="preserve"> </w:t>
+      </w:r>
+      <w:r>
+        <w:t xml:space="preserve">It will be added. Do not reconstruct a DOI, a page number, a</w:t>
+      </w:r>
+      <w:r>
+        <w:t xml:space="preserve"> </w:t>
+      </w:r>
+      <w:r>
+        <w:t xml:space="preserve">quoted sentence, or an author list from memory — one reconstructed DOI in an</w:t>
+      </w:r>
+      <w:r>
+        <w:t xml:space="preserve"> </w:t>
+      </w:r>
+      <w:r>
+        <w:t xml:space="preserve">earlier session pointed at the wrong paper.</w:t>
+      </w:r>
+    </w:p>
+    <w:p>
+      <w:pPr>
+        <w:numPr>
+          <w:ilvl w:val="0"/>
+          <w:numId w:val="1001"/>
+        </w:numPr>
+        <w:pStyle w:val="Compact"/>
+      </w:pPr>
+      <w:r>
+        <w:t xml:space="preserve">If something is inferred rather than measured, label it as inference in the same</w:t>
+      </w:r>
+      <w:r>
+        <w:t xml:space="preserve"> </w:t>
+      </w:r>
+      <w:r>
+        <w:t xml:space="preserve">sentence.</w:t>
+      </w:r>
+      <w:r>
+        <w:t xml:space="preserve"> </w:t>
+      </w:r>
+      <w:r>
+        <w:t xml:space="preserve">“</w:t>
+      </w:r>
+      <w:r>
+        <w:t xml:space="preserve">The Hessian is scratch</w:t>
+      </w:r>
+      <w:r>
+        <w:t xml:space="preserve">”</w:t>
+      </w:r>
+      <w:r>
+        <w:t xml:space="preserve"> </w:t>
+      </w:r>
+      <w:r>
+        <w:t xml:space="preserve">and</w:t>
+      </w:r>
+      <w:r>
+        <w:t xml:space="preserve"> </w:t>
+      </w:r>
+      <w:r>
+        <w:t xml:space="preserve">“</w:t>
+      </w:r>
+      <w:r>
+        <w:t xml:space="preserve">the Hessian is named as scratch in</w:t>
+      </w:r>
+      <w:r>
+        <w:t xml:space="preserve"> </w:t>
+      </w:r>
+      <w:r>
+        <w:t xml:space="preserve">ORCA’s own output</w:t>
+      </w:r>
+      <w:r>
+        <w:t xml:space="preserve">”</w:t>
+      </w:r>
+      <w:r>
+        <w:t xml:space="preserve"> </w:t>
+      </w:r>
+      <w:r>
+        <w:t xml:space="preserve">are different claims.</w:t>
+      </w:r>
+    </w:p>
+    <w:p>
+      <w:pPr>
+        <w:numPr>
+          <w:ilvl w:val="0"/>
+          <w:numId w:val="1001"/>
+        </w:numPr>
+        <w:pStyle w:val="Compact"/>
+      </w:pPr>
+      <w:r>
+        <w:t xml:space="preserve">When asked whether something is the case, the answer is a command, not a view.</w:t>
+      </w:r>
+    </w:p>
+    <w:bookmarkEnd w:id="20"/>
+    <w:bookmarkStart w:id="21" w:name="check-the-actual-output-every-time"/>
+    <w:p>
+      <w:pPr>
+        <w:pStyle w:val="Heading3"/>
+      </w:pPr>
+      <w:r>
+        <w:t xml:space="preserve">Check the actual output, every time</w:t>
+      </w:r>
+    </w:p>
+    <w:p>
+      <w:pPr>
+        <w:numPr>
+          <w:ilvl w:val="0"/>
+          <w:numId w:val="1002"/>
+        </w:numPr>
+        <w:pStyle w:val="Compact"/>
+      </w:pPr>
+      <w:r>
+        <w:rPr>
+          <w:bCs/>
+          <w:b/>
+        </w:rPr>
+        <w:t xml:space="preserve">A generator passing</w:t>
+      </w:r>
+      <w:r>
+        <w:rPr>
+          <w:bCs/>
+          <w:b/>
+        </w:rPr>
+        <w:t xml:space="preserve"> </w:t>
+      </w:r>
+      <w:r>
+        <w:rPr>
+          <w:rStyle w:val="VerbatimChar"/>
+          <w:bCs/>
+          <w:b/>
+        </w:rPr>
+        <w:t xml:space="preserve">bash -n</w:t>
+      </w:r>
+      <w:r>
+        <w:rPr>
+          <w:bCs/>
+          <w:b/>
+        </w:rPr>
+        <w:t xml:space="preserve"> </w:t>
+      </w:r>
+      <w:r>
+        <w:rPr>
+          <w:bCs/>
+          <w:b/>
+        </w:rPr>
+        <w:t xml:space="preserve">says nothing about what it writes.</w:t>
+      </w:r>
+      <w:r>
+        <w:t xml:space="preserve"> </w:t>
+      </w:r>
+      <w:r>
+        <w:t xml:space="preserve">After</w:t>
+      </w:r>
+      <w:r>
+        <w:t xml:space="preserve"> </w:t>
+      </w:r>
+      <w:r>
+        <w:t xml:space="preserve">changing a generator, regenerate one frame and grep the generated file. This</w:t>
+      </w:r>
+      <w:r>
+        <w:t xml:space="preserve"> </w:t>
+      </w:r>
+      <w:r>
+        <w:t xml:space="preserve">caught the spring constant living in a copied driver rather than the generator</w:t>
+      </w:r>
+      <w:r>
+        <w:t xml:space="preserve"> </w:t>
+      </w:r>
+      <w:r>
+        <w:t xml:space="preserve">that was edited.</w:t>
+      </w:r>
+    </w:p>
+    <w:p>
+      <w:pPr>
+        <w:numPr>
+          <w:ilvl w:val="0"/>
+          <w:numId w:val="1002"/>
+        </w:numPr>
+        <w:pStyle w:val="Compact"/>
+      </w:pPr>
+      <w:r>
+        <w:rPr>
+          <w:bCs/>
+          <w:b/>
+        </w:rPr>
+        <w:t xml:space="preserve">Never infer a job’s state from the presence of an output file.</w:t>
+      </w:r>
+      <w:r>
+        <w:t xml:space="preserve"> </w:t>
+      </w:r>
+      <w:r>
+        <w:t xml:space="preserve">PBS writes</w:t>
+      </w:r>
+      <w:r>
+        <w:t xml:space="preserve"> </w:t>
+      </w:r>
+      <w:r>
+        <w:t xml:space="preserve">its output at job end, and ORCA writes window files on completion, so a running</w:t>
+      </w:r>
+      <w:r>
+        <w:t xml:space="preserve"> </w:t>
+      </w:r>
+      <w:r>
+        <w:t xml:space="preserve">job and an unstarted one look identical on disk. Ask</w:t>
+      </w:r>
+      <w:r>
+        <w:t xml:space="preserve"> </w:t>
+      </w:r>
+      <w:r>
+        <w:rPr>
+          <w:rStyle w:val="VerbatimChar"/>
+        </w:rPr>
+        <w:t xml:space="preserve">qstat</w:t>
+      </w:r>
+      <w:r>
+        <w:t xml:space="preserve">.</w:t>
+      </w:r>
+    </w:p>
+    <w:p>
+      <w:pPr>
+        <w:numPr>
+          <w:ilvl w:val="0"/>
+          <w:numId w:val="1002"/>
+        </w:numPr>
+        <w:pStyle w:val="Compact"/>
+      </w:pPr>
+      <w:r>
+        <w:rPr>
+          <w:bCs/>
+          <w:b/>
+        </w:rPr>
+        <w:t xml:space="preserve">An empty grep is not a negative result</w:t>
+      </w:r>
+      <w:r>
+        <w:t xml:space="preserve"> </w:t>
+      </w:r>
+      <w:r>
+        <w:t xml:space="preserve">until the file has been confirmed to</w:t>
+      </w:r>
+      <w:r>
+        <w:t xml:space="preserve"> </w:t>
+      </w:r>
+      <w:r>
+        <w:t xml:space="preserve">exist and the pattern confirmed to be right. Several</w:t>
+      </w:r>
+      <w:r>
+        <w:t xml:space="preserve"> </w:t>
+      </w:r>
+      <w:r>
+        <w:t xml:space="preserve">“</w:t>
+      </w:r>
+      <w:r>
+        <w:t xml:space="preserve">nothing found</w:t>
+      </w:r>
+      <w:r>
+        <w:t xml:space="preserve">”</w:t>
+      </w:r>
+      <w:r>
+        <w:t xml:space="preserve"> </w:t>
+      </w:r>
+      <w:r>
+        <w:t xml:space="preserve">readings in</w:t>
+      </w:r>
+      <w:r>
+        <w:t xml:space="preserve"> </w:t>
+      </w:r>
+      <w:r>
+        <w:t xml:space="preserve">this project were the wrong path or the wrong search term.</w:t>
+      </w:r>
+    </w:p>
+    <w:p>
+      <w:pPr>
+        <w:numPr>
+          <w:ilvl w:val="0"/>
+          <w:numId w:val="1002"/>
+        </w:numPr>
+        <w:pStyle w:val="Compact"/>
+      </w:pPr>
+      <w:r>
+        <w:rPr>
+          <w:bCs/>
+          <w:b/>
+        </w:rPr>
+        <w:t xml:space="preserve">Absence of a success marker is not absence of progress.</w:t>
+      </w:r>
+      <w:r>
+        <w:t xml:space="preserve"> </w:t>
+      </w:r>
+      <w:r>
+        <w:t xml:space="preserve">A stage that has</w:t>
+      </w:r>
+      <w:r>
+        <w:t xml:space="preserve"> </w:t>
+      </w:r>
+      <w:r>
+        <w:t xml:space="preserve">produced 52,000 lines of output and is running at 780 per cent CPU is working,</w:t>
+      </w:r>
+      <w:r>
+        <w:t xml:space="preserve"> </w:t>
+      </w:r>
+      <w:r>
+        <w:t xml:space="preserve">whatever it has not yet printed.</w:t>
+      </w:r>
+    </w:p>
+    <w:p>
+      <w:pPr>
+        <w:numPr>
+          <w:ilvl w:val="0"/>
+          <w:numId w:val="1002"/>
+        </w:numPr>
+        <w:pStyle w:val="Compact"/>
+      </w:pPr>
+      <w:r>
+        <w:rPr>
+          <w:bCs/>
+          <w:b/>
+        </w:rPr>
+        <w:t xml:space="preserve">Re-read a file after editing it.</w:t>
+      </w:r>
+      <w:r>
+        <w:t xml:space="preserve"> </w:t>
+      </w:r>
+      <w:r>
+        <w:t xml:space="preserve">Earlier output in a conversation is stale</w:t>
+      </w:r>
+      <w:r>
+        <w:t xml:space="preserve"> </w:t>
+      </w:r>
+      <w:r>
+        <w:t xml:space="preserve">the moment anything changes.</w:t>
+      </w:r>
+    </w:p>
+    <w:bookmarkEnd w:id="21"/>
+    <w:bookmarkStart w:id="22" w:name="when-something-looks-wrong"/>
+    <w:p>
+      <w:pPr>
+        <w:pStyle w:val="Heading3"/>
+      </w:pPr>
+      <w:r>
+        <w:t xml:space="preserve">When something looks wrong</w:t>
+      </w:r>
+    </w:p>
+    <w:p>
+      <w:pPr>
+        <w:pStyle w:val="FirstParagraph"/>
+      </w:pPr>
+      <w:r>
+        <w:t xml:space="preserve">Measure before concluding. Three examples from this session where the first</w:t>
+      </w:r>
+      <w:r>
+        <w:t xml:space="preserve"> </w:t>
+      </w:r>
+      <w:r>
+        <w:t xml:space="preserve">explanation was wrong and a measurement settled it: the transition-state stage</w:t>
+      </w:r>
+      <w:r>
+        <w:t xml:space="preserve"> </w:t>
+      </w:r>
+      <w:r>
+        <w:t xml:space="preserve">was not stalled but slow; the memory shortfall was not the cause of that</w:t>
+      </w:r>
+      <w:r>
+        <w:t xml:space="preserve"> </w:t>
+      </w:r>
+      <w:r>
+        <w:t xml:space="preserve">slowness; and the top-site disagreement between frames was near-degeneracy in the</w:t>
+      </w:r>
+      <w:r>
+        <w:t xml:space="preserve"> </w:t>
+      </w:r>
+      <w:r>
+        <w:t xml:space="preserve">ranking rather than disagreement about location.</w:t>
+      </w:r>
+    </w:p>
+    <w:bookmarkEnd w:id="22"/>
+    <w:bookmarkStart w:id="23" w:name="scope"/>
+    <w:p>
+      <w:pPr>
+        <w:pStyle w:val="Heading3"/>
+      </w:pPr>
+      <w:r>
+        <w:t xml:space="preserve">Scope</w:t>
+      </w:r>
+    </w:p>
+    <w:p>
+      <w:pPr>
+        <w:pStyle w:val="FirstParagraph"/>
+      </w:pPr>
+      <w:r>
+        <w:t xml:space="preserve">Do not widen a task without saying so. Deleting files, killing jobs and editing</w:t>
+      </w:r>
+      <w:r>
+        <w:t xml:space="preserve"> </w:t>
+      </w:r>
+      <w:r>
+        <w:t xml:space="preserve">committed scripts each need the reason stated and, where the action is</w:t>
+      </w:r>
+      <w:r>
+        <w:t xml:space="preserve"> </w:t>
+      </w:r>
+      <w:r>
+        <w:t xml:space="preserve">irreversible, confirmation.</w:t>
+      </w:r>
+    </w:p>
+    <w:p>
+      <w:r>
+        <w:pict>
+          <v:rect style="width:0;height:1.5pt" o:hralign="center" o:hrstd="t" o:hr="t"/>
+        </w:pict>
+      </w:r>
+    </w:p>
+    <w:bookmarkEnd w:id="23"/>
+    <w:bookmarkEnd w:id="24"/>
+    <w:bookmarkStart w:id="25" w:name="where-the-pipeline-is-now"/>
     <w:p>
       <w:pPr>
         <w:pStyle w:val="Heading2"/>
@@ -323,8 +849,8 @@
         <w:t xml:space="preserve">call repeatedly.</w:t>
       </w:r>
     </w:p>
-    <w:bookmarkEnd w:id="20"/>
-    <w:bookmarkStart w:id="21" w:name="the-ensemble-already-accepted"/>
+    <w:bookmarkEnd w:id="25"/>
+    <w:bookmarkStart w:id="26" w:name="the-ensemble-already-accepted"/>
     <w:p>
       <w:pPr>
         <w:pStyle w:val="Heading2"/>
@@ -475,8 +1001,8 @@
         <w:t xml:space="preserve">work is at 22 kJ/mol. Claeyssens at 7 is the tight end of the field, not the norm.</w:t>
       </w:r>
     </w:p>
-    <w:bookmarkEnd w:id="21"/>
-    <w:bookmarkStart w:id="26" w:name="faults-found-and-corrected"/>
+    <w:bookmarkEnd w:id="26"/>
+    <w:bookmarkStart w:id="31" w:name="faults-found-and-corrected"/>
     <w:p>
       <w:pPr>
         <w:pStyle w:val="Heading2"/>
@@ -485,7 +1011,7 @@
         <w:t xml:space="preserve">3. Faults found and corrected</w:t>
       </w:r>
     </w:p>
-    <w:bookmarkStart w:id="22" w:name="X012a988d82af94c0d4d9c8625008f25c1735d61"/>
+    <w:bookmarkStart w:id="27" w:name="X012a988d82af94c0d4d9c8625008f25c1735d61"/>
     <w:p>
       <w:pPr>
         <w:pStyle w:val="Heading3"/>
@@ -827,8 +1353,8 @@
         <w:t xml:space="preserve">colvar in 6.0; it does not exist.</w:t>
       </w:r>
     </w:p>
-    <w:bookmarkEnd w:id="22"/>
-    <w:bookmarkStart w:id="23" w:name="X3cbad717a59483d7f0be6dc0ee3de533bd73c81"/>
+    <w:bookmarkEnd w:id="27"/>
+    <w:bookmarkStart w:id="28" w:name="X3cbad717a59483d7f0be6dc0ee3de533bd73c81"/>
     <w:p>
       <w:pPr>
         <w:pStyle w:val="Heading3"/>
@@ -1232,8 +1758,8 @@
         <w:t xml:space="preserve">request.</w:t>
       </w:r>
     </w:p>
-    <w:bookmarkEnd w:id="23"/>
-    <w:bookmarkStart w:id="24" w:name="Xa0e37655e48dc2bb03401635bb7db8bbf68c836"/>
+    <w:bookmarkEnd w:id="28"/>
+    <w:bookmarkStart w:id="29" w:name="Xa0e37655e48dc2bb03401635bb7db8bbf68c836"/>
     <w:p>
       <w:pPr>
         <w:pStyle w:val="Heading3"/>
@@ -1365,8 +1891,8 @@
         <w:t xml:space="preserve">direction.</w:t>
       </w:r>
     </w:p>
-    <w:bookmarkEnd w:id="24"/>
-    <w:bookmarkStart w:id="25" w:name="cleanup-deleted-an-input"/>
+    <w:bookmarkEnd w:id="29"/>
+    <w:bookmarkStart w:id="30" w:name="cleanup-deleted-an-input"/>
     <w:p>
       <w:pPr>
         <w:pStyle w:val="Heading3"/>
@@ -1440,9 +1966,9 @@
         <w:t xml:space="preserve">restores it.</w:t>
       </w:r>
     </w:p>
-    <w:bookmarkEnd w:id="25"/>
-    <w:bookmarkEnd w:id="26"/>
-    <w:bookmarkStart w:id="33" w:name="X13328254e3f2cb067c37a281f67799827038ca3"/>
+    <w:bookmarkEnd w:id="30"/>
+    <w:bookmarkEnd w:id="31"/>
+    <w:bookmarkStart w:id="38" w:name="X13328254e3f2cb067c37a281f67799827038ca3"/>
     <w:p>
       <w:pPr>
         <w:pStyle w:val="Heading2"/>
@@ -1451,7 +1977,7 @@
         <w:t xml:space="preserve">4. Sampling quality: settled, with a stated limitation</w:t>
       </w:r>
     </w:p>
-    <w:bookmarkStart w:id="27" w:name="the-molecular-dynamics"/>
+    <w:bookmarkStart w:id="32" w:name="the-molecular-dynamics"/>
     <w:p>
       <w:pPr>
         <w:pStyle w:val="Heading3"/>
@@ -1474,8 +2000,8 @@
         <w:t xml:space="preserve">and density 1.0222.</w:t>
       </w:r>
     </w:p>
-    <w:bookmarkEnd w:id="27"/>
-    <w:bookmarkStart w:id="28" w:name="X2059e6e21280c18d4888d69181fbd3f65c126c0"/>
+    <w:bookmarkEnd w:id="32"/>
+    <w:bookmarkStart w:id="33" w:name="X2059e6e21280c18d4888d69181fbd3f65c126c0"/>
     <w:p>
       <w:pPr>
         <w:pStyle w:val="Heading3"/>
@@ -1897,8 +2423,8 @@
         <w:t xml:space="preserve">independent. Neither predicts the barrier.</w:t>
       </w:r>
     </w:p>
-    <w:bookmarkEnd w:id="28"/>
-    <w:bookmarkStart w:id="29" w:name="Xa9f3d1f3b06003aabf6e6baf032c03ee58968cd"/>
+    <w:bookmarkEnd w:id="33"/>
+    <w:bookmarkStart w:id="34" w:name="Xa9f3d1f3b06003aabf6e6baf032c03ee58968cd"/>
     <w:p>
       <w:pPr>
         <w:pStyle w:val="Heading3"/>
@@ -1981,8 +2507,8 @@
         <w:t xml:space="preserve">0.487 is not evidence of absence. Revisit once thirty barriers exist.</w:t>
       </w:r>
     </w:p>
-    <w:bookmarkEnd w:id="29"/>
-    <w:bookmarkStart w:id="30" w:name="the-equilibration-cut"/>
+    <w:bookmarkEnd w:id="34"/>
+    <w:bookmarkStart w:id="35" w:name="the-equilibration-cut"/>
     <w:p>
       <w:pPr>
         <w:pStyle w:val="Heading3"/>
@@ -2038,8 +2564,8 @@
         <w:t xml:space="preserve">minimum estimated correlation time.</w:t>
       </w:r>
     </w:p>
-    <w:bookmarkEnd w:id="30"/>
-    <w:bookmarkStart w:id="31" w:name="the-trajectory-does-revisit-states"/>
+    <w:bookmarkEnd w:id="35"/>
+    <w:bookmarkStart w:id="36" w:name="the-trajectory-does-revisit-states"/>
     <w:p>
       <w:pPr>
         <w:pStyle w:val="Heading3"/>
@@ -2127,8 +2653,8 @@
         <w:t xml:space="preserve">the apparent drift is exploration rather than escape to a new structure.</w:t>
       </w:r>
     </w:p>
-    <w:bookmarkEnd w:id="31"/>
-    <w:bookmarkStart w:id="32" w:name="the-selection"/>
+    <w:bookmarkEnd w:id="36"/>
+    <w:bookmarkStart w:id="37" w:name="the-selection"/>
     <w:p>
       <w:pPr>
         <w:pStyle w:val="Heading3"/>
@@ -2196,9 +2722,9 @@
         <w:t xml:space="preserve">.</w:t>
       </w:r>
     </w:p>
-    <w:bookmarkEnd w:id="32"/>
-    <w:bookmarkEnd w:id="33"/>
-    <w:bookmarkStart w:id="37" w:name="design-objective-two-tests-complete"/>
+    <w:bookmarkEnd w:id="37"/>
+    <w:bookmarkEnd w:id="38"/>
+    <w:bookmarkStart w:id="42" w:name="design-objective-two-tests-complete"/>
     <w:p>
       <w:pPr>
         <w:pStyle w:val="Heading2"/>
@@ -2207,7 +2733,7 @@
         <w:t xml:space="preserve">5. Design objective: two tests complete</w:t>
       </w:r>
     </w:p>
-    <w:bookmarkStart w:id="34" w:name="Xf048810b5dbf257d2e4a692c2e78cf53bc1cf88"/>
+    <w:bookmarkStart w:id="39" w:name="Xf048810b5dbf257d2e4a692c2e78cf53bc1cf88"/>
     <w:p>
       <w:pPr>
         <w:pStyle w:val="Heading3"/>
@@ -2285,8 +2811,8 @@
         <w:t xml:space="preserve">resolution limit. The failure measured at unit charge does not transfer.</w:t>
       </w:r>
     </w:p>
-    <w:bookmarkEnd w:id="34"/>
-    <w:bookmarkStart w:id="35" w:name="Xfb17e2b879270f1aedc2525f1f63064627cca4b"/>
+    <w:bookmarkEnd w:id="39"/>
+    <w:bookmarkStart w:id="40" w:name="Xfb17e2b879270f1aedc2525f1f63064627cca4b"/>
     <w:p>
       <w:pPr>
         <w:pStyle w:val="Heading3"/>
@@ -2510,8 +3036,8 @@
         <w:t xml:space="preserve">holds the mean and per-site standard deviation.</w:t>
       </w:r>
     </w:p>
-    <w:bookmarkEnd w:id="35"/>
-    <w:bookmarkStart w:id="36" w:name="Xbafa17e5de6bb17506b940f405819b37f72f8e4"/>
+    <w:bookmarkEnd w:id="40"/>
+    <w:bookmarkStart w:id="41" w:name="Xbafa17e5de6bb17506b940f405819b37f72f8e4"/>
     <w:p>
       <w:pPr>
         <w:pStyle w:val="Heading3"/>
@@ -2670,9 +3196,9 @@
         <w:t xml:space="preserve">is a region, not a point.</w:t>
       </w:r>
     </w:p>
-    <w:bookmarkEnd w:id="36"/>
-    <w:bookmarkEnd w:id="37"/>
-    <w:bookmarkStart w:id="38" w:name="X127eebb53ecd311e73d8a4da22c62933ed4f808"/>
+    <w:bookmarkEnd w:id="41"/>
+    <w:bookmarkEnd w:id="42"/>
+    <w:bookmarkStart w:id="43" w:name="X127eebb53ecd311e73d8a4da22c62933ed4f808"/>
     <w:p>
       <w:pPr>
         <w:pStyle w:val="Heading2"/>
@@ -2714,386 +3240,6 @@
       </w:r>
       <w:r>
         <w:t xml:space="preserve">stalled; both times I was wrong:</w:t>
-      </w:r>
-    </w:p>
-    <w:p>
-      <w:pPr>
-        <w:numPr>
-          <w:ilvl w:val="0"/>
-          <w:numId w:val="1001"/>
-        </w:numPr>
-        <w:pStyle w:val="Compact"/>
-      </w:pPr>
-      <w:r>
-        <w:t xml:space="preserve">The first reading looked for a success marker and found none. The stage was</w:t>
-      </w:r>
-      <w:r>
-        <w:t xml:space="preserve"> </w:t>
-      </w:r>
-      <w:r>
-        <w:t xml:space="preserve">producing 52,000 lines of output.</w:t>
-      </w:r>
-    </w:p>
-    <w:p>
-      <w:pPr>
-        <w:numPr>
-          <w:ilvl w:val="0"/>
-          <w:numId w:val="1001"/>
-        </w:numPr>
-        <w:pStyle w:val="Compact"/>
-      </w:pPr>
-      <w:r>
-        <w:t xml:space="preserve">The second attributed the slowness to the memory shortfall. At the corrected</w:t>
-      </w:r>
-      <w:r>
-        <w:t xml:space="preserve"> </w:t>
-      </w:r>
-      <w:r>
-        <w:t xml:space="preserve">250 GB it is equally slow, so memory was not the cause. CPU is at 780 per cent,</w:t>
-      </w:r>
-      <w:r>
-        <w:t xml:space="preserve"> </w:t>
-      </w:r>
-      <w:r>
-        <w:t xml:space="preserve">so it is computing, not idle.</w:t>
-      </w:r>
-    </w:p>
-    <w:p>
-      <w:pPr>
-        <w:pStyle w:val="FirstParagraph"/>
-      </w:pPr>
-      <w:r>
-        <w:t xml:space="preserve">Current frames are at 3 to 5 cycles. Frame 43738’s first cycle gave RMS gradient</w:t>
-      </w:r>
-      <w:r>
-        <w:t xml:space="preserve"> </w:t>
-      </w:r>
-      <w:r>
-        <w:t xml:space="preserve">0.000057 and MAX 0.00172, at or inside typical tolerances.</w:t>
-      </w:r>
-    </w:p>
-    <w:p>
-      <w:pPr>
-        <w:pStyle w:val="BodyText"/>
-      </w:pPr>
-      <w:r>
-        <w:rPr>
-          <w:bCs/>
-          <w:b/>
-        </w:rPr>
-        <w:t xml:space="preserve">The barrier does not depend on this stage.</w:t>
-      </w:r>
-      <w:r>
-        <w:t xml:space="preserve"> </w:t>
-      </w:r>
-      <w:r>
-        <w:t xml:space="preserve">It comes from the path summary</w:t>
-      </w:r>
-      <w:r>
-        <w:t xml:space="preserve"> </w:t>
-      </w:r>
-      <w:r>
-        <w:t xml:space="preserve">written at band convergence.</w:t>
-      </w:r>
-    </w:p>
-    <w:p>
-      <w:pPr>
-        <w:pStyle w:val="BodyText"/>
-      </w:pPr>
-      <w:r>
-        <w:rPr>
-          <w:bCs/>
-          <w:b/>
-        </w:rPr>
-        <w:t xml:space="preserve">And the published work does not converge a saddle at all.</w:t>
-      </w:r>
-      <w:r>
-        <w:t xml:space="preserve"> </w:t>
-      </w:r>
-      <w:r>
-        <w:t xml:space="preserve">Claeyssens</w:t>
-      </w:r>
-      <w:r>
-        <w:t xml:space="preserve"> </w:t>
-      </w:r>
-      <w:r>
-        <w:rPr>
-          <w:iCs/>
-          <w:i/>
-        </w:rPr>
-        <w:t xml:space="preserve">et al.</w:t>
-      </w:r>
-      <w:r>
-        <w:t xml:space="preserve"> </w:t>
-      </w:r>
-      <w:r>
-        <w:t xml:space="preserve">take</w:t>
-      </w:r>
-      <w:r>
-        <w:t xml:space="preserve"> </w:t>
-      </w:r>
-      <w:r>
-        <w:t xml:space="preserve">“</w:t>
-      </w:r>
-      <w:r>
-        <w:t xml:space="preserve">the highest point, the approximate TS structure, at r values between -0.5</w:t>
-      </w:r>
-      <w:r>
-        <w:t xml:space="preserve"> </w:t>
-      </w:r>
-      <w:r>
-        <w:t xml:space="preserve">and -0.7 A</w:t>
-      </w:r>
-      <w:r>
-        <w:t xml:space="preserve">”</w:t>
-      </w:r>
-      <w:r>
-        <w:t xml:space="preserve"> </w:t>
-      </w:r>
-      <w:r>
-        <w:t xml:space="preserve">from a restrained scan. The climbing image is more converged than</w:t>
-      </w:r>
-      <w:r>
-        <w:t xml:space="preserve"> </w:t>
-      </w:r>
-      <w:r>
-        <w:t xml:space="preserve">that. The refined saddle would be an improvement on something already adequate by</w:t>
-      </w:r>
-      <w:r>
-        <w:t xml:space="preserve"> </w:t>
-      </w:r>
-      <w:r>
-        <w:t xml:space="preserve">the published standard, not a requirement.</w:t>
-      </w:r>
-    </w:p>
-    <w:p>
-      <w:pPr>
-        <w:pStyle w:val="BodyText"/>
-      </w:pPr>
-      <w:r>
-        <w:rPr>
-          <w:bCs/>
-          <w:b/>
-        </w:rPr>
-        <w:t xml:space="preserve">Decision still open:</w:t>
-      </w:r>
-      <w:r>
-        <w:t xml:space="preserve"> </w:t>
-      </w:r>
-      <w:r>
-        <w:t xml:space="preserve">whether to let all thirty run this stage. Compare a</w:t>
-      </w:r>
-      <w:r>
-        <w:t xml:space="preserve"> </w:t>
-      </w:r>
-      <w:r>
-        <w:t xml:space="preserve">refined saddle against its climbing image when one converges; if they differ</w:t>
-      </w:r>
-      <w:r>
-        <w:t xml:space="preserve"> </w:t>
-      </w:r>
-      <w:r>
-        <w:t xml:space="preserve">negligibly, the remaining frames can skip it with evidence.</w:t>
-      </w:r>
-    </w:p>
-    <w:bookmarkEnd w:id="38"/>
-    <w:bookmarkStart w:id="39" w:name="conclusions-overturned-do-not-re-derive"/>
-    <w:p>
-      <w:pPr>
-        <w:pStyle w:val="Heading2"/>
-      </w:pPr>
-      <w:r>
-        <w:t xml:space="preserve">7. Conclusions overturned — do not re-derive</w:t>
-      </w:r>
-    </w:p>
-    <w:p>
-      <w:pPr>
-        <w:numPr>
-          <w:ilvl w:val="0"/>
-          <w:numId w:val="1002"/>
-        </w:numPr>
-        <w:pStyle w:val="Compact"/>
-      </w:pPr>
-      <w:r>
-        <w:rPr>
-          <w:bCs/>
-          <w:b/>
-        </w:rPr>
-        <w:t xml:space="preserve">The barrier spread indicates a defect.</w:t>
-      </w:r>
-      <w:r>
-        <w:t xml:space="preserve"> </w:t>
-      </w:r>
-      <w:r>
-        <w:t xml:space="preserve">It does not; Ryde’s survey puts this</w:t>
-      </w:r>
-      <w:r>
-        <w:t xml:space="preserve"> </w:t>
-      </w:r>
-      <w:r>
-        <w:t xml:space="preserve">work mid-range.</w:t>
-      </w:r>
-    </w:p>
-    <w:p>
-      <w:pPr>
-        <w:numPr>
-          <w:ilvl w:val="0"/>
-          <w:numId w:val="1002"/>
-        </w:numPr>
-        <w:pStyle w:val="Compact"/>
-      </w:pPr>
-      <w:r>
-        <w:rPr>
-          <w:bCs/>
-          <w:b/>
-        </w:rPr>
-        <w:t xml:space="preserve">ORCA’s separate quantum and classical energies can be read as chemistry and</w:t>
-      </w:r>
-      <w:r>
-        <w:rPr>
-          <w:bCs/>
-          <w:b/>
-        </w:rPr>
-        <w:t xml:space="preserve"> </w:t>
-      </w:r>
-      <w:r>
-        <w:rPr>
-          <w:bCs/>
-          <w:b/>
-        </w:rPr>
-        <w:t xml:space="preserve">environment.</w:t>
-      </w:r>
-      <w:r>
-        <w:t xml:space="preserve"> </w:t>
-      </w:r>
-      <w:r>
-        <w:t xml:space="preserve">Under electrostatic embedding the quantum term already contains</w:t>
-      </w:r>
-      <w:r>
-        <w:t xml:space="preserve"> </w:t>
-      </w:r>
-      <w:r>
-        <w:t xml:space="preserve">the coupling (Senn and Thiel). The correct separation is a single point on the</w:t>
-      </w:r>
-      <w:r>
-        <w:t xml:space="preserve"> </w:t>
-      </w:r>
-      <w:r>
-        <w:t xml:space="preserve">isolated substrate at the QM/MM geometry, which is what Claeyssens do and what</w:t>
-      </w:r>
-      <w:r>
-        <w:t xml:space="preserve"> </w:t>
-      </w:r>
-      <w:r>
-        <w:t xml:space="preserve">produced the -4.32.</w:t>
-      </w:r>
-    </w:p>
-    <w:p>
-      <w:pPr>
-        <w:numPr>
-          <w:ilvl w:val="0"/>
-          <w:numId w:val="1002"/>
-        </w:numPr>
-        <w:pStyle w:val="Compact"/>
-      </w:pPr>
-      <w:r>
-        <w:rPr>
-          <w:bCs/>
-          <w:b/>
-        </w:rPr>
-        <w:t xml:space="preserve">The frames are independent because the forming distance decorrelates in 3.2</w:t>
-      </w:r>
-      <w:r>
-        <w:rPr>
-          <w:bCs/>
-          <w:b/>
-        </w:rPr>
-        <w:t xml:space="preserve"> </w:t>
-      </w:r>
-      <w:r>
-        <w:rPr>
-          <w:bCs/>
-          <w:b/>
-        </w:rPr>
-        <w:t xml:space="preserve">ps.</w:t>
-      </w:r>
-      <w:r>
-        <w:t xml:space="preserve"> </w:t>
-      </w:r>
-      <w:r>
-        <w:t xml:space="preserve">That distance does not predict the barrier.</w:t>
-      </w:r>
-    </w:p>
-    <w:p>
-      <w:pPr>
-        <w:numPr>
-          <w:ilvl w:val="0"/>
-          <w:numId w:val="1002"/>
-        </w:numPr>
-        <w:pStyle w:val="Compact"/>
-      </w:pPr>
-      <w:r>
-        <w:rPr>
-          <w:bCs/>
-          <w:b/>
-        </w:rPr>
-        <w:t xml:space="preserve">The transition-state optimisation is stalled.</w:t>
-      </w:r>
-      <w:r>
-        <w:t xml:space="preserve"> </w:t>
-      </w:r>
-      <w:r>
-        <w:t xml:space="preserve">It is slow. See section 6.</w:t>
-      </w:r>
-    </w:p>
-    <w:p>
-      <w:pPr>
-        <w:numPr>
-          <w:ilvl w:val="0"/>
-          <w:numId w:val="1002"/>
-        </w:numPr>
-        <w:pStyle w:val="Compact"/>
-      </w:pPr>
-      <w:r>
-        <w:rPr>
-          <w:bCs/>
-          <w:b/>
-        </w:rPr>
-        <w:t xml:space="preserve">The memory shortfall explains the slow TS stage.</w:t>
-      </w:r>
-      <w:r>
-        <w:t xml:space="preserve"> </w:t>
-      </w:r>
-      <w:r>
-        <w:t xml:space="preserve">It does not; the corrected</w:t>
-      </w:r>
-      <w:r>
-        <w:t xml:space="preserve"> </w:t>
-      </w:r>
-      <w:r>
-        <w:t xml:space="preserve">250 GB is equally slow.</w:t>
-      </w:r>
-    </w:p>
-    <w:bookmarkEnd w:id="39"/>
-    <w:bookmarkStart w:id="40" w:name="outstanding"/>
-    <w:p>
-      <w:pPr>
-        <w:pStyle w:val="Heading2"/>
-      </w:pPr>
-      <w:r>
-        <w:t xml:space="preserve">8. Outstanding</w:t>
-      </w:r>
-    </w:p>
-    <w:p>
-      <w:pPr>
-        <w:pStyle w:val="FirstParagraph"/>
-      </w:pPr>
-      <w:r>
-        <w:rPr>
-          <w:bCs/>
-          <w:b/>
-        </w:rPr>
-        <w:t xml:space="preserve">Immediate</w:t>
       </w:r>
     </w:p>
     <w:p>
@@ -3105,7 +3251,13 @@
         <w:pStyle w:val="Compact"/>
       </w:pPr>
       <w:r>
-        <w:t xml:space="preserve">Run the remaining 26 bands, four at a time, harvesting between batches.</w:t>
+        <w:t xml:space="preserve">The first reading looked for a success marker and found none. The stage was</w:t>
+      </w:r>
+      <w:r>
+        <w:t xml:space="preserve"> </w:t>
+      </w:r>
+      <w:r>
+        <w:t xml:space="preserve">producing 52,000 lines of output.</w:t>
       </w:r>
     </w:p>
     <w:p>
@@ -3117,52 +3269,19 @@
         <w:pStyle w:val="Compact"/>
       </w:pPr>
       <w:r>
-        <w:t xml:space="preserve">In vacuo single points for the new frames, so stabilisation can be compared</w:t>
-      </w:r>
-      <w:r>
-        <w:t xml:space="preserve"> </w:t>
-      </w:r>
-      <w:r>
-        <w:t xml:space="preserve">against Claeyssens’ -4.2. Not yet run; their column in</w:t>
-      </w:r>
-      <w:r>
-        <w:t xml:space="preserve"> </w:t>
-      </w:r>
-      <w:r>
-        <w:rPr>
-          <w:rStyle w:val="VerbatimChar"/>
-        </w:rPr>
-        <w:t xml:space="preserve">ensemble_barriers.tsv</w:t>
-      </w:r>
-      <w:r>
-        <w:t xml:space="preserve"> </w:t>
-      </w:r>
-      <w:r>
-        <w:t xml:space="preserve">is empty.</w:t>
-      </w:r>
-    </w:p>
-    <w:p>
-      <w:pPr>
-        <w:numPr>
-          <w:ilvl w:val="0"/>
-          <w:numId w:val="1003"/>
-        </w:numPr>
-        <w:pStyle w:val="Compact"/>
-      </w:pPr>
-      <w:r>
-        <w:t xml:space="preserve">Frame 08170 still has no barrier. Its guess was 7.18 kcal/mol above the scan</w:t>
-      </w:r>
-      <w:r>
-        <w:t xml:space="preserve"> </w:t>
-      </w:r>
-      <w:r>
-        <w:t xml:space="preserve">start, the lowest of fourteen, and its band collapsed. Rerun at the corrected</w:t>
-      </w:r>
-      <w:r>
-        <w:t xml:space="preserve"> </w:t>
-      </w:r>
-      <w:r>
-        <w:t xml:space="preserve">spring or document the exclusion.</w:t>
+        <w:t xml:space="preserve">The second attributed the slowness to the memory shortfall. At the corrected</w:t>
+      </w:r>
+      <w:r>
+        <w:t xml:space="preserve"> </w:t>
+      </w:r>
+      <w:r>
+        <w:t xml:space="preserve">250 GB it is equally slow, so memory was not the cause. CPU is at 780 per cent,</w:t>
+      </w:r>
+      <w:r>
+        <w:t xml:space="preserve"> </w:t>
+      </w:r>
+      <w:r>
+        <w:t xml:space="preserve">so it is computing, not idle.</w:t>
       </w:r>
     </w:p>
     <w:p>
@@ -3170,11 +3289,147 @@
         <w:pStyle w:val="FirstParagraph"/>
       </w:pPr>
       <w:r>
-        <w:rPr>
-          <w:bCs/>
-          <w:b/>
-        </w:rPr>
-        <w:t xml:space="preserve">Design</w:t>
+        <w:t xml:space="preserve">Current frames are at 3 to 5 cycles. Frame 43738’s first cycle gave RMS gradient</w:t>
+      </w:r>
+      <w:r>
+        <w:t xml:space="preserve"> </w:t>
+      </w:r>
+      <w:r>
+        <w:t xml:space="preserve">0.000057 and MAX 0.00172, at or inside typical tolerances.</w:t>
+      </w:r>
+    </w:p>
+    <w:p>
+      <w:pPr>
+        <w:pStyle w:val="BodyText"/>
+      </w:pPr>
+      <w:r>
+        <w:rPr>
+          <w:bCs/>
+          <w:b/>
+        </w:rPr>
+        <w:t xml:space="preserve">The barrier does not depend on this stage.</w:t>
+      </w:r>
+      <w:r>
+        <w:t xml:space="preserve"> </w:t>
+      </w:r>
+      <w:r>
+        <w:t xml:space="preserve">It comes from the path summary</w:t>
+      </w:r>
+      <w:r>
+        <w:t xml:space="preserve"> </w:t>
+      </w:r>
+      <w:r>
+        <w:t xml:space="preserve">written at band convergence.</w:t>
+      </w:r>
+    </w:p>
+    <w:p>
+      <w:pPr>
+        <w:pStyle w:val="BodyText"/>
+      </w:pPr>
+      <w:r>
+        <w:rPr>
+          <w:bCs/>
+          <w:b/>
+        </w:rPr>
+        <w:t xml:space="preserve">And the published work does not converge a saddle at all.</w:t>
+      </w:r>
+      <w:r>
+        <w:t xml:space="preserve"> </w:t>
+      </w:r>
+      <w:r>
+        <w:t xml:space="preserve">Claeyssens</w:t>
+      </w:r>
+      <w:r>
+        <w:t xml:space="preserve"> </w:t>
+      </w:r>
+      <w:r>
+        <w:rPr>
+          <w:iCs/>
+          <w:i/>
+        </w:rPr>
+        <w:t xml:space="preserve">et al.</w:t>
+      </w:r>
+      <w:r>
+        <w:t xml:space="preserve"> </w:t>
+      </w:r>
+      <w:r>
+        <w:t xml:space="preserve">take</w:t>
+      </w:r>
+      <w:r>
+        <w:t xml:space="preserve"> </w:t>
+      </w:r>
+      <w:r>
+        <w:t xml:space="preserve">“</w:t>
+      </w:r>
+      <w:r>
+        <w:t xml:space="preserve">the highest point, the approximate TS structure, at r values between -0.5</w:t>
+      </w:r>
+      <w:r>
+        <w:t xml:space="preserve"> </w:t>
+      </w:r>
+      <w:r>
+        <w:t xml:space="preserve">and -0.7 A</w:t>
+      </w:r>
+      <w:r>
+        <w:t xml:space="preserve">”</w:t>
+      </w:r>
+      <w:r>
+        <w:t xml:space="preserve"> </w:t>
+      </w:r>
+      <w:r>
+        <w:t xml:space="preserve">from a restrained scan. The climbing image is more converged than</w:t>
+      </w:r>
+      <w:r>
+        <w:t xml:space="preserve"> </w:t>
+      </w:r>
+      <w:r>
+        <w:t xml:space="preserve">that. The refined saddle would be an improvement on something already adequate by</w:t>
+      </w:r>
+      <w:r>
+        <w:t xml:space="preserve"> </w:t>
+      </w:r>
+      <w:r>
+        <w:t xml:space="preserve">the published standard, not a requirement.</w:t>
+      </w:r>
+    </w:p>
+    <w:p>
+      <w:pPr>
+        <w:pStyle w:val="BodyText"/>
+      </w:pPr>
+      <w:r>
+        <w:rPr>
+          <w:bCs/>
+          <w:b/>
+        </w:rPr>
+        <w:t xml:space="preserve">Decision still open:</w:t>
+      </w:r>
+      <w:r>
+        <w:t xml:space="preserve"> </w:t>
+      </w:r>
+      <w:r>
+        <w:t xml:space="preserve">whether to let all thirty run this stage. Compare a</w:t>
+      </w:r>
+      <w:r>
+        <w:t xml:space="preserve"> </w:t>
+      </w:r>
+      <w:r>
+        <w:t xml:space="preserve">refined saddle against its climbing image when one converges; if they differ</w:t>
+      </w:r>
+      <w:r>
+        <w:t xml:space="preserve"> </w:t>
+      </w:r>
+      <w:r>
+        <w:t xml:space="preserve">negligibly, the remaining frames can skip it with evidence.</w:t>
+      </w:r>
+    </w:p>
+    <w:bookmarkEnd w:id="43"/>
+    <w:bookmarkStart w:id="44" w:name="conclusions-overturned-do-not-re-derive"/>
+    <w:p>
+      <w:pPr>
+        <w:pStyle w:val="Heading2"/>
+      </w:pPr>
+      <w:r>
+        <w:t xml:space="preserve">7. Conclusions overturned — do not re-derive</w:t>
       </w:r>
     </w:p>
     <w:p>
@@ -3186,56 +3441,23 @@
         <w:pStyle w:val="Compact"/>
       </w:pPr>
       <w:r>
-        <w:t xml:space="preserve">Choose the objective. Four formulations, all but the last linear: single frame;</w:t>
-      </w:r>
-      <w:r>
-        <w:t xml:space="preserve"> </w:t>
-      </w:r>
-      <w:r>
-        <w:t xml:space="preserve">ensemble mean; mean penalised by spread, max sum q(mu - lambda sigma); and</w:t>
-      </w:r>
-      <w:r>
-        <w:t xml:space="preserve"> </w:t>
-      </w:r>
-      <w:r>
-        <w:t xml:space="preserve">minimax, max t subject to t &lt;= sum q Dv_f for every frame. Ryde records the</w:t>
-      </w:r>
-      <w:r>
-        <w:t xml:space="preserve"> </w:t>
-      </w:r>
-      <w:r>
-        <w:t xml:space="preserve">consensus for combining snapshot energies as an</w:t>
-      </w:r>
-      <w:r>
-        <w:t xml:space="preserve"> </w:t>
-      </w:r>
-      <w:r>
-        <w:rPr>
-          <w:bCs/>
-          <w:b/>
-        </w:rPr>
-        <w:t xml:space="preserve">exponential average</w:t>
-      </w:r>
-      <w:r>
-        <w:t xml:space="preserve">, since</w:t>
-      </w:r>
-      <w:r>
-        <w:t xml:space="preserve"> </w:t>
-      </w:r>
-      <w:r>
-        <w:t xml:space="preserve">the rate depends on exp(-dG/RT) — that objective is not linear and its</w:t>
-      </w:r>
-      <w:r>
-        <w:t xml:space="preserve"> </w:t>
-      </w:r>
-      <w:r>
-        <w:t xml:space="preserve">conditioning at this spread is unmeasured. Worth the supervisor’s view; the</w:t>
-      </w:r>
-      <w:r>
-        <w:t xml:space="preserve"> </w:t>
-      </w:r>
-      <w:r>
-        <w:t xml:space="preserve">three are different scientific claims.</w:t>
+        <w:rPr>
+          <w:bCs/>
+          <w:b/>
+        </w:rPr>
+        <w:t xml:space="preserve">The barrier spread indicates a defect.</w:t>
+      </w:r>
+      <w:r>
+        <w:t xml:space="preserve"> </w:t>
+      </w:r>
+      <w:r>
+        <w:t xml:space="preserve">It does not; Ryde’s survey puts this</w:t>
+      </w:r>
+      <w:r>
+        <w:t xml:space="preserve"> </w:t>
+      </w:r>
+      <w:r>
+        <w:t xml:space="preserve">work mid-range.</w:t>
       </w:r>
     </w:p>
     <w:p>
@@ -3247,13 +3469,49 @@
         <w:pStyle w:val="Compact"/>
       </w:pPr>
       <w:r>
-        <w:t xml:space="preserve">Per-site standard deviations assume sites vary independently. They do not.</w:t>
-      </w:r>
-      <w:r>
-        <w:t xml:space="preserve"> </w:t>
-      </w:r>
-      <w:r>
-        <w:t xml:space="preserve">The covariance is computable from the ten frames’ full vectors, which exist.</w:t>
+        <w:rPr>
+          <w:bCs/>
+          <w:b/>
+        </w:rPr>
+        <w:t xml:space="preserve">ORCA’s separate quantum and classical energies can be read as chemistry and</w:t>
+      </w:r>
+      <w:r>
+        <w:rPr>
+          <w:bCs/>
+          <w:b/>
+        </w:rPr>
+        <w:t xml:space="preserve"> </w:t>
+      </w:r>
+      <w:r>
+        <w:rPr>
+          <w:bCs/>
+          <w:b/>
+        </w:rPr>
+        <w:t xml:space="preserve">environment.</w:t>
+      </w:r>
+      <w:r>
+        <w:t xml:space="preserve"> </w:t>
+      </w:r>
+      <w:r>
+        <w:t xml:space="preserve">Under electrostatic embedding the quantum term already contains</w:t>
+      </w:r>
+      <w:r>
+        <w:t xml:space="preserve"> </w:t>
+      </w:r>
+      <w:r>
+        <w:t xml:space="preserve">the coupling (Senn and Thiel). The correct separation is a single point on the</w:t>
+      </w:r>
+      <w:r>
+        <w:t xml:space="preserve"> </w:t>
+      </w:r>
+      <w:r>
+        <w:t xml:space="preserve">isolated substrate at the QM/MM geometry, which is what Claeyssens do and what</w:t>
+      </w:r>
+      <w:r>
+        <w:t xml:space="preserve"> </w:t>
+      </w:r>
+      <w:r>
+        <w:t xml:space="preserve">produced the -4.32.</w:t>
       </w:r>
     </w:p>
     <w:p>
@@ -3265,13 +3523,91 @@
         <w:pStyle w:val="Compact"/>
       </w:pPr>
       <w:r>
-        <w:t xml:space="preserve">Check whether two charges can even be placed: the favourable region is 4 to 5 A</w:t>
-      </w:r>
-      <w:r>
-        <w:t xml:space="preserve"> </w:t>
-      </w:r>
-      <w:r>
-        <w:t xml:space="preserve">across and the separation constraint is 3.5 A.</w:t>
+        <w:rPr>
+          <w:bCs/>
+          <w:b/>
+        </w:rPr>
+        <w:t xml:space="preserve">The frames are independent because the forming distance decorrelates in 3.2</w:t>
+      </w:r>
+      <w:r>
+        <w:rPr>
+          <w:bCs/>
+          <w:b/>
+        </w:rPr>
+        <w:t xml:space="preserve"> </w:t>
+      </w:r>
+      <w:r>
+        <w:rPr>
+          <w:bCs/>
+          <w:b/>
+        </w:rPr>
+        <w:t xml:space="preserve">ps.</w:t>
+      </w:r>
+      <w:r>
+        <w:t xml:space="preserve"> </w:t>
+      </w:r>
+      <w:r>
+        <w:t xml:space="preserve">That distance does not predict the barrier.</w:t>
+      </w:r>
+    </w:p>
+    <w:p>
+      <w:pPr>
+        <w:numPr>
+          <w:ilvl w:val="0"/>
+          <w:numId w:val="1004"/>
+        </w:numPr>
+        <w:pStyle w:val="Compact"/>
+      </w:pPr>
+      <w:r>
+        <w:rPr>
+          <w:bCs/>
+          <w:b/>
+        </w:rPr>
+        <w:t xml:space="preserve">The transition-state optimisation is stalled.</w:t>
+      </w:r>
+      <w:r>
+        <w:t xml:space="preserve"> </w:t>
+      </w:r>
+      <w:r>
+        <w:t xml:space="preserve">It is slow. See section 6.</w:t>
+      </w:r>
+    </w:p>
+    <w:p>
+      <w:pPr>
+        <w:numPr>
+          <w:ilvl w:val="0"/>
+          <w:numId w:val="1004"/>
+        </w:numPr>
+        <w:pStyle w:val="Compact"/>
+      </w:pPr>
+      <w:r>
+        <w:rPr>
+          <w:bCs/>
+          <w:b/>
+        </w:rPr>
+        <w:t xml:space="preserve">The memory shortfall explains the slow TS stage.</w:t>
+      </w:r>
+      <w:r>
+        <w:t xml:space="preserve"> </w:t>
+      </w:r>
+      <w:r>
+        <w:t xml:space="preserve">It does not; the corrected</w:t>
+      </w:r>
+      <w:r>
+        <w:t xml:space="preserve"> </w:t>
+      </w:r>
+      <w:r>
+        <w:t xml:space="preserve">250 GB is equally slow.</w:t>
+      </w:r>
+    </w:p>
+    <w:bookmarkEnd w:id="44"/>
+    <w:bookmarkStart w:id="45" w:name="outstanding"/>
+    <w:p>
+      <w:pPr>
+        <w:pStyle w:val="Heading2"/>
+      </w:pPr>
+      <w:r>
+        <w:t xml:space="preserve">8. Outstanding</w:t>
       </w:r>
     </w:p>
     <w:p>
@@ -3283,7 +3619,7 @@
           <w:bCs/>
           <w:b/>
         </w:rPr>
-        <w:t xml:space="preserve">Write-up</w:t>
+        <w:t xml:space="preserve">Immediate</w:t>
       </w:r>
     </w:p>
     <w:p>
@@ -3295,7 +3631,7 @@
         <w:pStyle w:val="Compact"/>
       </w:pPr>
       <w:r>
-        <w:t xml:space="preserve">Zero-point and thermal corrections before comparing to an activation enthalpy.</w:t>
+        <w:t xml:space="preserve">Run the remaining 26 bands, four at a time, harvesting between batches.</w:t>
       </w:r>
     </w:p>
     <w:p>
@@ -3307,7 +3643,28 @@
         <w:pStyle w:val="Compact"/>
       </w:pPr>
       <w:r>
-        <w:t xml:space="preserve">The reference transition state shows two imaginary modes where one is expected.</w:t>
+        <w:t xml:space="preserve">In vacuo single points for the new frames, so stabilisation can be compared</w:t>
+      </w:r>
+      <w:r>
+        <w:t xml:space="preserve"> </w:t>
+      </w:r>
+      <w:r>
+        <w:t xml:space="preserve">against Claeyssens’ -4.2. Not yet run; their column in</w:t>
+      </w:r>
+      <w:r>
+        <w:t xml:space="preserve"> </w:t>
+      </w:r>
+      <w:r>
+        <w:rPr>
+          <w:rStyle w:val="VerbatimChar"/>
+        </w:rPr>
+        <w:t xml:space="preserve">ensemble_barriers.tsv</w:t>
+      </w:r>
+      <w:r>
+        <w:t xml:space="preserve"> </w:t>
+      </w:r>
+      <w:r>
+        <w:t xml:space="preserve">is empty.</w:t>
       </w:r>
     </w:p>
     <w:p>
@@ -3319,47 +3676,31 @@
         <w:pStyle w:val="Compact"/>
       </w:pPr>
       <w:r>
-        <w:t xml:space="preserve">Section X.1.4 claims one level of theory throughout; false after the basis split</w:t>
-      </w:r>
-      <w:r>
-        <w:t xml:space="preserve"> </w:t>
-      </w:r>
-      <w:r>
-        <w:t xml:space="preserve">(Phase 1 def2-SVP, Phase 2 def2-SVPD).</w:t>
-      </w:r>
-    </w:p>
-    <w:p>
-      <w:pPr>
-        <w:numPr>
-          <w:ilvl w:val="0"/>
-          <w:numId w:val="1005"/>
-        </w:numPr>
-        <w:pStyle w:val="Compact"/>
-      </w:pPr>
-      <w:r>
-        <w:t xml:space="preserve">Arithmetic averaging stated as a considered choice, per Ryde’s guidance.</w:t>
-      </w:r>
-    </w:p>
-    <w:p>
-      <w:pPr>
-        <w:numPr>
-          <w:ilvl w:val="0"/>
-          <w:numId w:val="1005"/>
-        </w:numPr>
-        <w:pStyle w:val="Compact"/>
-      </w:pPr>
-      <w:r>
-        <w:t xml:space="preserve">Frame 820, the Phase 2 reference, is at 820 ps and therefore pre-equilibration.</w:t>
-      </w:r>
-    </w:p>
-    <w:bookmarkEnd w:id="40"/>
-    <w:bookmarkStart w:id="41" w:name="working-discipline-that-earned-its-place"/>
-    <w:p>
-      <w:pPr>
-        <w:pStyle w:val="Heading2"/>
-      </w:pPr>
-      <w:r>
-        <w:t xml:space="preserve">9. Working discipline that earned its place</w:t>
+        <w:t xml:space="preserve">Frame 08170 still has no barrier. Its guess was 7.18 kcal/mol above the scan</w:t>
+      </w:r>
+      <w:r>
+        <w:t xml:space="preserve"> </w:t>
+      </w:r>
+      <w:r>
+        <w:t xml:space="preserve">start, the lowest of fourteen, and its band collapsed. Rerun at the corrected</w:t>
+      </w:r>
+      <w:r>
+        <w:t xml:space="preserve"> </w:t>
+      </w:r>
+      <w:r>
+        <w:t xml:space="preserve">spring or document the exclusion.</w:t>
+      </w:r>
+    </w:p>
+    <w:p>
+      <w:pPr>
+        <w:pStyle w:val="FirstParagraph"/>
+      </w:pPr>
+      <w:r>
+        <w:rPr>
+          <w:bCs/>
+          <w:b/>
+        </w:rPr>
+        <w:t xml:space="preserve">Design</w:t>
       </w:r>
     </w:p>
     <w:p>
@@ -3371,35 +3712,56 @@
         <w:pStyle w:val="Compact"/>
       </w:pPr>
       <w:r>
-        <w:t xml:space="preserve">Verify a generator’s change in the</w:t>
-      </w:r>
-      <w:r>
-        <w:t xml:space="preserve"> </w:t>
-      </w:r>
-      <w:r>
-        <w:rPr>
-          <w:bCs/>
-          <w:b/>
-        </w:rPr>
-        <w:t xml:space="preserve">generated file</w:t>
-      </w:r>
-      <w:r>
-        <w:t xml:space="preserve">, not just the generator.</w:t>
-      </w:r>
-      <w:r>
-        <w:t xml:space="preserve"> </w:t>
-      </w:r>
-      <w:r>
-        <w:rPr>
-          <w:rStyle w:val="VerbatimChar"/>
-        </w:rPr>
-        <w:t xml:space="preserve">bash -n</w:t>
-      </w:r>
-      <w:r>
-        <w:t xml:space="preserve"> </w:t>
-      </w:r>
-      <w:r>
-        <w:t xml:space="preserve">on a script says nothing about what it writes.</w:t>
+        <w:t xml:space="preserve">Choose the objective. Four formulations, all but the last linear: single frame;</w:t>
+      </w:r>
+      <w:r>
+        <w:t xml:space="preserve"> </w:t>
+      </w:r>
+      <w:r>
+        <w:t xml:space="preserve">ensemble mean; mean penalised by spread, max sum q(mu - lambda sigma); and</w:t>
+      </w:r>
+      <w:r>
+        <w:t xml:space="preserve"> </w:t>
+      </w:r>
+      <w:r>
+        <w:t xml:space="preserve">minimax, max t subject to t &lt;= sum q Dv_f for every frame. Ryde records the</w:t>
+      </w:r>
+      <w:r>
+        <w:t xml:space="preserve"> </w:t>
+      </w:r>
+      <w:r>
+        <w:t xml:space="preserve">consensus for combining snapshot energies as an</w:t>
+      </w:r>
+      <w:r>
+        <w:t xml:space="preserve"> </w:t>
+      </w:r>
+      <w:r>
+        <w:rPr>
+          <w:bCs/>
+          <w:b/>
+        </w:rPr>
+        <w:t xml:space="preserve">exponential average</w:t>
+      </w:r>
+      <w:r>
+        <w:t xml:space="preserve">, since</w:t>
+      </w:r>
+      <w:r>
+        <w:t xml:space="preserve"> </w:t>
+      </w:r>
+      <w:r>
+        <w:t xml:space="preserve">the rate depends on exp(-dG/RT) — that objective is not linear and its</w:t>
+      </w:r>
+      <w:r>
+        <w:t xml:space="preserve"> </w:t>
+      </w:r>
+      <w:r>
+        <w:t xml:space="preserve">conditioning at this spread is unmeasured. Worth the supervisor’s view; the</w:t>
+      </w:r>
+      <w:r>
+        <w:t xml:space="preserve"> </w:t>
+      </w:r>
+      <w:r>
+        <w:t xml:space="preserve">three are different scientific claims.</w:t>
       </w:r>
     </w:p>
     <w:p>
@@ -3411,19 +3773,13 @@
         <w:pStyle w:val="Compact"/>
       </w:pPr>
       <w:r>
-        <w:t xml:space="preserve">Never infer a job’s state from the presence of an output file. Ask</w:t>
-      </w:r>
-      <w:r>
-        <w:t xml:space="preserve"> </w:t>
-      </w:r>
-      <w:r>
-        <w:rPr>
-          <w:rStyle w:val="VerbatimChar"/>
-        </w:rPr>
-        <w:t xml:space="preserve">qstat</w:t>
-      </w:r>
-      <w:r>
-        <w:t xml:space="preserve">.</w:t>
+        <w:t xml:space="preserve">Per-site standard deviations assume sites vary independently. They do not.</w:t>
+      </w:r>
+      <w:r>
+        <w:t xml:space="preserve"> </w:t>
+      </w:r>
+      <w:r>
+        <w:t xml:space="preserve">The covariance is computable from the ten frames’ full vectors, which exist.</w:t>
       </w:r>
     </w:p>
     <w:p>
@@ -3435,69 +3791,614 @@
         <w:pStyle w:val="Compact"/>
       </w:pPr>
       <w:r>
-        <w:t xml:space="preserve">When renaming a variable, grep</w:t>
-      </w:r>
-      <w:r>
-        <w:t xml:space="preserve"> </w:t>
-      </w:r>
-      <w:r>
-        <w:rPr>
-          <w:bCs/>
-          <w:b/>
-        </w:rPr>
-        <w:t xml:space="preserve">every</w:t>
-      </w:r>
-      <w:r>
-        <w:t xml:space="preserve"> </w:t>
-      </w:r>
-      <w:r>
-        <w:t xml:space="preserve">occurrence and account for each.</w:t>
+        <w:t xml:space="preserve">Check whether two charges can even be placed: the favourable region is 4 to 5 A</w:t>
+      </w:r>
+      <w:r>
+        <w:t xml:space="preserve"> </w:t>
+      </w:r>
+      <w:r>
+        <w:t xml:space="preserve">across and the separation constraint is 3.5 A.</w:t>
+      </w:r>
+    </w:p>
+    <w:p>
+      <w:pPr>
+        <w:pStyle w:val="FirstParagraph"/>
+      </w:pPr>
+      <w:r>
+        <w:rPr>
+          <w:bCs/>
+          <w:b/>
+        </w:rPr>
+        <w:t xml:space="preserve">Write-up</w:t>
       </w:r>
     </w:p>
     <w:p>
       <w:pPr>
         <w:numPr>
           <w:ilvl w:val="0"/>
-          <w:numId w:val="1006"/>
+          <w:numId w:val="1007"/>
         </w:numPr>
         <w:pStyle w:val="Compact"/>
       </w:pPr>
       <w:r>
-        <w:t xml:space="preserve">Copy the production driver rather than reconstructing an input from a grepped</w:t>
-      </w:r>
-      <w:r>
-        <w:t xml:space="preserve"> </w:t>
-      </w:r>
-      <w:r>
-        <w:t xml:space="preserve">fragment. The stage that copied never drifted; the stage that rewrote did.</w:t>
+        <w:t xml:space="preserve">Zero-point and thermal corrections before comparing to an activation enthalpy.</w:t>
       </w:r>
     </w:p>
     <w:p>
       <w:pPr>
         <w:numPr>
           <w:ilvl w:val="0"/>
-          <w:numId w:val="1006"/>
+          <w:numId w:val="1007"/>
         </w:numPr>
         <w:pStyle w:val="Compact"/>
       </w:pPr>
       <w:r>
-        <w:t xml:space="preserve">Check what a job actually uses before trusting its resource request.</w:t>
+        <w:t xml:space="preserve">The reference transition state shows two imaginary modes where one is expected.</w:t>
       </w:r>
     </w:p>
     <w:p>
       <w:pPr>
         <w:numPr>
           <w:ilvl w:val="0"/>
-          <w:numId w:val="1006"/>
+          <w:numId w:val="1007"/>
         </w:numPr>
         <w:pStyle w:val="Compact"/>
       </w:pPr>
       <w:r>
+        <w:t xml:space="preserve">Section X.1.4 claims one level of theory throughout; false after the basis split</w:t>
+      </w:r>
+      <w:r>
+        <w:t xml:space="preserve"> </w:t>
+      </w:r>
+      <w:r>
+        <w:t xml:space="preserve">(Phase 1 def2-SVP, Phase 2 def2-SVPD).</w:t>
+      </w:r>
+    </w:p>
+    <w:p>
+      <w:pPr>
+        <w:numPr>
+          <w:ilvl w:val="0"/>
+          <w:numId w:val="1007"/>
+        </w:numPr>
+        <w:pStyle w:val="Compact"/>
+      </w:pPr>
+      <w:r>
+        <w:t xml:space="preserve">Arithmetic averaging stated as a considered choice, per Ryde’s guidance.</w:t>
+      </w:r>
+    </w:p>
+    <w:p>
+      <w:pPr>
+        <w:numPr>
+          <w:ilvl w:val="0"/>
+          <w:numId w:val="1007"/>
+        </w:numPr>
+        <w:pStyle w:val="Compact"/>
+      </w:pPr>
+      <w:r>
+        <w:t xml:space="preserve">Frame 820, the Phase 2 reference, is at 820 ps and therefore pre-equilibration.</w:t>
+      </w:r>
+    </w:p>
+    <w:bookmarkEnd w:id="45"/>
+    <w:bookmarkStart w:id="46" w:name="working-discipline-that-earned-its-place"/>
+    <w:p>
+      <w:pPr>
+        <w:pStyle w:val="Heading2"/>
+      </w:pPr>
+      <w:r>
+        <w:t xml:space="preserve">9. Working discipline that earned its place</w:t>
+      </w:r>
+    </w:p>
+    <w:p>
+      <w:pPr>
+        <w:numPr>
+          <w:ilvl w:val="0"/>
+          <w:numId w:val="1008"/>
+        </w:numPr>
+        <w:pStyle w:val="Compact"/>
+      </w:pPr>
+      <w:r>
+        <w:t xml:space="preserve">Verify a generator’s change in the</w:t>
+      </w:r>
+      <w:r>
+        <w:t xml:space="preserve"> </w:t>
+      </w:r>
+      <w:r>
+        <w:rPr>
+          <w:bCs/>
+          <w:b/>
+        </w:rPr>
+        <w:t xml:space="preserve">generated file</w:t>
+      </w:r>
+      <w:r>
+        <w:t xml:space="preserve">, not just the generator.</w:t>
+      </w:r>
+      <w:r>
+        <w:t xml:space="preserve"> </w:t>
+      </w:r>
+      <w:r>
+        <w:rPr>
+          <w:rStyle w:val="VerbatimChar"/>
+        </w:rPr>
+        <w:t xml:space="preserve">bash -n</w:t>
+      </w:r>
+      <w:r>
+        <w:t xml:space="preserve"> </w:t>
+      </w:r>
+      <w:r>
+        <w:t xml:space="preserve">on a script says nothing about what it writes.</w:t>
+      </w:r>
+    </w:p>
+    <w:p>
+      <w:pPr>
+        <w:numPr>
+          <w:ilvl w:val="0"/>
+          <w:numId w:val="1008"/>
+        </w:numPr>
+        <w:pStyle w:val="Compact"/>
+      </w:pPr>
+      <w:r>
+        <w:t xml:space="preserve">Never infer a job’s state from the presence of an output file. Ask</w:t>
+      </w:r>
+      <w:r>
+        <w:t xml:space="preserve"> </w:t>
+      </w:r>
+      <w:r>
+        <w:rPr>
+          <w:rStyle w:val="VerbatimChar"/>
+        </w:rPr>
+        <w:t xml:space="preserve">qstat</w:t>
+      </w:r>
+      <w:r>
+        <w:t xml:space="preserve">.</w:t>
+      </w:r>
+    </w:p>
+    <w:p>
+      <w:pPr>
+        <w:numPr>
+          <w:ilvl w:val="0"/>
+          <w:numId w:val="1008"/>
+        </w:numPr>
+        <w:pStyle w:val="Compact"/>
+      </w:pPr>
+      <w:r>
+        <w:t xml:space="preserve">When renaming a variable, grep</w:t>
+      </w:r>
+      <w:r>
+        <w:t xml:space="preserve"> </w:t>
+      </w:r>
+      <w:r>
+        <w:rPr>
+          <w:bCs/>
+          <w:b/>
+        </w:rPr>
+        <w:t xml:space="preserve">every</w:t>
+      </w:r>
+      <w:r>
+        <w:t xml:space="preserve"> </w:t>
+      </w:r>
+      <w:r>
+        <w:t xml:space="preserve">occurrence and account for each.</w:t>
+      </w:r>
+    </w:p>
+    <w:p>
+      <w:pPr>
+        <w:numPr>
+          <w:ilvl w:val="0"/>
+          <w:numId w:val="1008"/>
+        </w:numPr>
+        <w:pStyle w:val="Compact"/>
+      </w:pPr>
+      <w:r>
+        <w:t xml:space="preserve">Copy the production driver rather than reconstructing an input from a grepped</w:t>
+      </w:r>
+      <w:r>
+        <w:t xml:space="preserve"> </w:t>
+      </w:r>
+      <w:r>
+        <w:t xml:space="preserve">fragment. The stage that copied never drifted; the stage that rewrote did.</w:t>
+      </w:r>
+    </w:p>
+    <w:p>
+      <w:pPr>
+        <w:numPr>
+          <w:ilvl w:val="0"/>
+          <w:numId w:val="1008"/>
+        </w:numPr>
+        <w:pStyle w:val="Compact"/>
+      </w:pPr>
+      <w:r>
+        <w:t xml:space="preserve">Check what a job actually uses before trusting its resource request.</w:t>
+      </w:r>
+    </w:p>
+    <w:p>
+      <w:pPr>
+        <w:numPr>
+          <w:ilvl w:val="0"/>
+          <w:numId w:val="1008"/>
+        </w:numPr>
+        <w:pStyle w:val="Compact"/>
+      </w:pPr>
+      <w:r>
         <w:t xml:space="preserve">Absence of a success marker is not evidence of no progress. Count iterations.</w:t>
       </w:r>
     </w:p>
-    <w:bookmarkEnd w:id="41"/>
-    <w:bookmarkStart w:id="42" w:name="references"/>
+    <w:bookmarkEnd w:id="46"/>
+    <w:bookmarkStart w:id="47" w:name="where-things-live"/>
+    <w:p>
+      <w:pPr>
+        <w:pStyle w:val="Heading2"/>
+      </w:pPr>
+      <w:r>
+        <w:t xml:space="preserve">10. Where things live</w:t>
+      </w:r>
+    </w:p>
+    <w:p>
+      <w:pPr>
+        <w:pStyle w:val="FirstParagraph"/>
+      </w:pPr>
+      <w:r>
+        <w:rPr>
+          <w:bCs/>
+          <w:b/>
+        </w:rPr>
+        <w:t xml:space="preserve">Repositories</w:t>
+      </w:r>
+      <w:r>
+        <w:t xml:space="preserve"> </w:t>
+      </w:r>
+      <w:r>
+        <w:t xml:space="preserve">- Code:</w:t>
+      </w:r>
+      <w:r>
+        <w:t xml:space="preserve"> </w:t>
+      </w:r>
+      <w:r>
+        <w:rPr>
+          <w:rStyle w:val="VerbatimChar"/>
+        </w:rPr>
+        <w:t xml:space="preserve">~/Desktop/chorismate_thesis_code</w:t>
+      </w:r>
+      <w:r>
+        <w:t xml:space="preserve">, branch</w:t>
+      </w:r>
+      <w:r>
+        <w:t xml:space="preserve"> </w:t>
+      </w:r>
+      <w:r>
+        <w:rPr>
+          <w:rStyle w:val="VerbatimChar"/>
+        </w:rPr>
+        <w:t xml:space="preserve">tier1-realism</w:t>
+      </w:r>
+      <w:r>
+        <w:t xml:space="preserve"> </w:t>
+      </w:r>
+      <w:r>
+        <w:t xml:space="preserve">- Results:</w:t>
+      </w:r>
+      <w:r>
+        <w:t xml:space="preserve"> </w:t>
+      </w:r>
+      <w:r>
+        <w:rPr>
+          <w:rStyle w:val="VerbatimChar"/>
+        </w:rPr>
+        <w:t xml:space="preserve">~/Desktop/chorismate-thesis-results</w:t>
+      </w:r>
+      <w:r>
+        <w:t xml:space="preserve">, branch</w:t>
+      </w:r>
+      <w:r>
+        <w:t xml:space="preserve"> </w:t>
+      </w:r>
+      <w:r>
+        <w:rPr>
+          <w:rStyle w:val="VerbatimChar"/>
+        </w:rPr>
+        <w:t xml:space="preserve">main</w:t>
+      </w:r>
+      <w:r>
+        <w:t xml:space="preserve"> </w:t>
+      </w:r>
+      <w:r>
+        <w:t xml:space="preserve">- Cluster:</w:t>
+      </w:r>
+      <w:r>
+        <w:t xml:space="preserve"> </w:t>
+      </w:r>
+      <w:r>
+        <w:rPr>
+          <w:rStyle w:val="VerbatimChar"/>
+        </w:rPr>
+        <w:t xml:space="preserve">18660916@hpc1.sun.ac.za</w:t>
+      </w:r>
+      <w:r>
+        <w:t xml:space="preserve">, work under</w:t>
+      </w:r>
+      <w:r>
+        <w:t xml:space="preserve"> </w:t>
+      </w:r>
+      <w:r>
+        <w:rPr>
+          <w:rStyle w:val="VerbatimChar"/>
+        </w:rPr>
+        <w:t xml:space="preserve">~/system_development</w:t>
+      </w:r>
+    </w:p>
+    <w:p>
+      <w:pPr>
+        <w:pStyle w:val="BodyText"/>
+      </w:pPr>
+      <w:r>
+        <w:rPr>
+          <w:bCs/>
+          <w:b/>
+        </w:rPr>
+        <w:t xml:space="preserve">On the cluster</w:t>
+      </w:r>
+      <w:r>
+        <w:t xml:space="preserve"> </w:t>
+      </w:r>
+      <w:r>
+        <w:t xml:space="preserve">-</w:t>
+      </w:r>
+      <w:r>
+        <w:t xml:space="preserve"> </w:t>
+      </w:r>
+      <w:r>
+        <w:rPr>
+          <w:rStyle w:val="VerbatimChar"/>
+        </w:rPr>
+        <w:t xml:space="preserve">05_qmmm/19_ensemble/frame_NNNNN/</w:t>
+      </w:r>
+      <w:r>
+        <w:t xml:space="preserve"> </w:t>
+      </w:r>
+      <w:r>
+        <w:t xml:space="preserve">— one directory per frame, all stages</w:t>
+      </w:r>
+      <w:r>
+        <w:t xml:space="preserve"> </w:t>
+      </w:r>
+      <w:r>
+        <w:t xml:space="preserve">-</w:t>
+      </w:r>
+      <w:r>
+        <w:t xml:space="preserve"> </w:t>
+      </w:r>
+      <w:r>
+        <w:rPr>
+          <w:rStyle w:val="VerbatimChar"/>
+        </w:rPr>
+        <w:t xml:space="preserve">05_qmmm/19_ensemble_barriers/</w:t>
+      </w:r>
+      <w:r>
+        <w:t xml:space="preserve"> </w:t>
+      </w:r>
+      <w:r>
+        <w:t xml:space="preserve">— the harvest, which is what the analysis reads</w:t>
+      </w:r>
+      <w:r>
+        <w:t xml:space="preserve"> </w:t>
+      </w:r>
+      <w:r>
+        <w:t xml:space="preserve">-</w:t>
+      </w:r>
+      <w:r>
+        <w:t xml:space="preserve"> </w:t>
+      </w:r>
+      <w:r>
+        <w:rPr>
+          <w:rStyle w:val="VerbatimChar"/>
+        </w:rPr>
+        <w:t xml:space="preserve">05_qmmm/12_frame_selection/selection_manifest.tsv</w:t>
+      </w:r>
+      <w:r>
+        <w:t xml:space="preserve"> </w:t>
+      </w:r>
+      <w:r>
+        <w:t xml:space="preserve">— 45 frames, the first 15</w:t>
+      </w:r>
+      <w:r>
+        <w:t xml:space="preserve"> </w:t>
+      </w:r>
+      <w:r>
+        <w:t xml:space="preserve">from the original run and 30 renumbered from the extension</w:t>
+      </w:r>
+      <w:r>
+        <w:t xml:space="preserve"> </w:t>
+      </w:r>
+      <w:r>
+        <w:t xml:space="preserve">-</w:t>
+      </w:r>
+      <w:r>
+        <w:t xml:space="preserve"> </w:t>
+      </w:r>
+      <w:r>
+        <w:rPr>
+          <w:rStyle w:val="VerbatimChar"/>
+        </w:rPr>
+        <w:t xml:space="preserve">05_qmmm/16_scan/run_scan.sh</w:t>
+      </w:r>
+      <w:r>
+        <w:t xml:space="preserve"> </w:t>
+      </w:r>
+      <w:r>
+        <w:t xml:space="preserve">— the scan driver,</w:t>
+      </w:r>
+      <w:r>
+        <w:t xml:space="preserve"> </w:t>
+      </w:r>
+      <w:r>
+        <w:rPr>
+          <w:bCs/>
+          <w:b/>
+        </w:rPr>
+        <w:t xml:space="preserve">the single place the spring</w:t>
+      </w:r>
+      <w:r>
+        <w:rPr>
+          <w:bCs/>
+          <w:b/>
+        </w:rPr>
+        <w:t xml:space="preserve"> </w:t>
+      </w:r>
+      <w:r>
+        <w:rPr>
+          <w:bCs/>
+          <w:b/>
+        </w:rPr>
+        <w:t xml:space="preserve">constant is set</w:t>
+      </w:r>
+      <w:r>
+        <w:t xml:space="preserve">; it is copied into each frame</w:t>
+      </w:r>
+      <w:r>
+        <w:t xml:space="preserve"> </w:t>
+      </w:r>
+      <w:r>
+        <w:t xml:space="preserve">-</w:t>
+      </w:r>
+      <w:r>
+        <w:t xml:space="preserve"> </w:t>
+      </w:r>
+      <w:r>
+        <w:rPr>
+          <w:rStyle w:val="VerbatimChar"/>
+        </w:rPr>
+        <w:t xml:space="preserve">04_amber_md/10c_production/prod.nc</w:t>
+      </w:r>
+      <w:r>
+        <w:t xml:space="preserve"> </w:t>
+      </w:r>
+      <w:r>
+        <w:t xml:space="preserve">and</w:t>
+      </w:r>
+      <w:r>
+        <w:t xml:space="preserve"> </w:t>
+      </w:r>
+      <w:r>
+        <w:rPr>
+          <w:rStyle w:val="VerbatimChar"/>
+        </w:rPr>
+        <w:t xml:space="preserve">10d_production_extend/prod_ext.nc</w:t>
+      </w:r>
+      <w:r>
+        <w:t xml:space="preserve"> </w:t>
+      </w:r>
+      <w:r>
+        <w:t xml:space="preserve">—</w:t>
+      </w:r>
+      <w:r>
+        <w:t xml:space="preserve"> </w:t>
+      </w:r>
+      <w:r>
+        <w:t xml:space="preserve">one trajectory in two files, 20,000 and 40,000 frames; scripts route by index</w:t>
+      </w:r>
+      <w:r>
+        <w:t xml:space="preserve"> </w:t>
+      </w:r>
+      <w:r>
+        <w:t xml:space="preserve">-</w:t>
+      </w:r>
+      <w:r>
+        <w:t xml:space="preserve"> </w:t>
+      </w:r>
+      <w:r>
+        <w:rPr>
+          <w:rStyle w:val="VerbatimChar"/>
+        </w:rPr>
+        <w:t xml:space="preserve">phase2b_charge_design/08_frame_sensitivity/</w:t>
+      </w:r>
+      <w:r>
+        <w:t xml:space="preserve"> </w:t>
+      </w:r>
+      <w:r>
+        <w:t xml:space="preserve">— the per-frame difference</w:t>
+      </w:r>
+      <w:r>
+        <w:t xml:space="preserve"> </w:t>
+      </w:r>
+      <w:r>
+        <w:t xml:space="preserve">potentials and the ensemble-mean map</w:t>
+      </w:r>
+    </w:p>
+    <w:p>
+      <w:pPr>
+        <w:pStyle w:val="BodyText"/>
+      </w:pPr>
+      <w:r>
+        <w:rPr>
+          <w:bCs/>
+          <w:b/>
+        </w:rPr>
+        <w:t xml:space="preserve">Driving the pipeline</w:t>
+      </w:r>
+    </w:p>
+    <w:p>
+      <w:pPr>
+        <w:pStyle w:val="SourceCode"/>
+      </w:pPr>
+      <w:r>
+        <w:rPr>
+          <w:rStyle w:val="VerbatimChar"/>
+        </w:rPr>
+        <w:t xml:space="preserve">bash next.sh                              # advance scans and product optimisations</w:t>
+      </w:r>
+      <w:r>
+        <w:br/>
+      </w:r>
+      <w:r>
+        <w:rPr>
+          <w:rStyle w:val="VerbatimChar"/>
+        </w:rPr>
+        <w:t xml:space="preserve">bash run_ensemble_batched.sh status       # what is where</w:t>
+      </w:r>
+      <w:r>
+        <w:br/>
+      </w:r>
+      <w:r>
+        <w:rPr>
+          <w:rStyle w:val="VerbatimChar"/>
+        </w:rPr>
+        <w:t xml:space="preserve">bash run_ensemble_batched.sh stage4 4     # four bands</w:t>
+      </w:r>
+      <w:r>
+        <w:br/>
+      </w:r>
+      <w:r>
+        <w:rPr>
+          <w:rStyle w:val="VerbatimChar"/>
+        </w:rPr>
+        <w:t xml:space="preserve">bash run_ensemble_batched.sh harvest      # read barriers, free space</w:t>
+      </w:r>
+    </w:p>
+    <w:p>
+      <w:pPr>
+        <w:pStyle w:val="FirstParagraph"/>
+      </w:pPr>
+      <w:r>
+        <w:rPr>
+          <w:bCs/>
+          <w:b/>
+        </w:rPr>
+        <w:t xml:space="preserve">Papers held</w:t>
+      </w:r>
+      <w:r>
+        <w:t xml:space="preserve"> </w:t>
+      </w:r>
+      <w:r>
+        <w:t xml:space="preserve">are in the reference repository. If one is needed that is not</w:t>
+      </w:r>
+      <w:r>
+        <w:t xml:space="preserve"> </w:t>
+      </w:r>
+      <w:r>
+        <w:t xml:space="preserve">there, ask for the DOI.</w:t>
+      </w:r>
+    </w:p>
+    <w:bookmarkEnd w:id="47"/>
+    <w:bookmarkStart w:id="48" w:name="references"/>
     <w:p>
       <w:pPr>
         <w:pStyle w:val="Heading2"/>
@@ -3582,8 +4483,8 @@
         <w:t xml:space="preserve">Senn and Thiel (2009) doi:10.1002/anie.200802019</w:t>
       </w:r>
     </w:p>
-    <w:bookmarkEnd w:id="42"/>
-    <w:bookmarkEnd w:id="43"/>
+    <w:bookmarkEnd w:id="48"/>
+    <w:bookmarkEnd w:id="49"/>
     <w:sectPr/>
   </w:body>
 </w:document>
@@ -3858,6 +4759,12 @@
     <w:abstractNumId w:val="991"/>
   </w:num>
   <w:num w:numId="1002">
+    <w:abstractNumId w:val="991"/>
+  </w:num>
+  <w:num w:numId="1003">
+    <w:abstractNumId w:val="991"/>
+  </w:num>
+  <w:num w:numId="1004">
     <w:abstractNumId w:val="99411"/>
     <w:lvlOverride w:ilvl="0">
       <w:startOverride w:val="1"/>
@@ -3887,16 +4794,16 @@
       <w:startOverride w:val="1"/>
     </w:lvlOverride>
   </w:num>
-  <w:num w:numId="1003">
-    <w:abstractNumId w:val="991"/>
-  </w:num>
-  <w:num w:numId="1004">
-    <w:abstractNumId w:val="991"/>
-  </w:num>
   <w:num w:numId="1005">
     <w:abstractNumId w:val="991"/>
   </w:num>
   <w:num w:numId="1006">
+    <w:abstractNumId w:val="991"/>
+  </w:num>
+  <w:num w:numId="1007">
+    <w:abstractNumId w:val="991"/>
+  </w:num>
+  <w:num w:numId="1008">
     <w:abstractNumId w:val="991"/>
   </w:num>
 </w:numbering>

</xml_diff>